<commit_message>
Docs were not saved probably..
</commit_message>
<xml_diff>
--- a/doc/command interface.docx
+++ b/doc/command interface.docx
@@ -2591,10 +2591,10 @@
             <v:path o:extrusionok="f" gradientshapeok="t" o:connecttype="rect"/>
             <o:lock v:ext="edit" aspectratio="t"/>
           </v:shapetype>
-          <v:shape id="_x0000_i1025" type="#_x0000_t75" style="width:291.75pt;height:273pt" o:ole="">
+          <v:shape id="_x0000_i1025" type="#_x0000_t75" style="width:292.05pt;height:273pt" o:ole="">
             <v:imagedata r:id="rId8" o:title=""/>
           </v:shape>
-          <o:OLEObject Type="Embed" ProgID="Visio.Drawing.11" ShapeID="_x0000_i1025" DrawAspect="Content" ObjectID="_1834512658" r:id="rId9"/>
+          <o:OLEObject Type="Embed" ProgID="Visio.Drawing.11" ShapeID="_x0000_i1025" DrawAspect="Content" ObjectID="_1834557837" r:id="rId9"/>
         </w:object>
       </w:r>
     </w:p>
@@ -3715,13 +3715,7 @@
               <w:rPr>
                 <w:bCs/>
               </w:rPr>
-              <w:t>1.</w:t>
-            </w:r>
-            <w:r>
-              <w:rPr>
-                <w:bCs/>
-              </w:rPr>
-              <w:t>1</w:t>
+              <w:t>1.0</w:t>
             </w:r>
           </w:fldSimple>
           <w:r>
@@ -6752,6 +6746,7 @@
     <w:rsid w:val="000E5C16"/>
     <w:rsid w:val="00114319"/>
     <w:rsid w:val="003D7F14"/>
+    <w:rsid w:val="003E5D94"/>
     <w:rsid w:val="00427F76"/>
     <w:rsid w:val="00563128"/>
     <w:rsid w:val="006E2CD5"/>
@@ -6761,7 +6756,6 @@
     <w:rsid w:val="00AE1B17"/>
     <w:rsid w:val="00AE7445"/>
     <w:rsid w:val="00B8324E"/>
-    <w:rsid w:val="00C311CD"/>
     <w:rsid w:val="00C76122"/>
   </w:rsids>
   <m:mathPr>

</xml_diff>